<commit_message>
References: add ICESat-2 intertidal-DEM literature; fix Wang mis-citation, Carrère bib/order
- Add Xu et al. (2022, GRL), Zhang et al. (2022, GRL), Xin et al. (2025, IJDE)
  on ICESat-2 / waterline-fusion intertidal topography, cited in §1.1, §1.2 and
  §5.3(b) (the upper-intertidal band optical sampling cannot reach).
- Move the Wang et al. (2020) citation off the aerial-LiDAR claim it did not
  support; re-home it to the §1.2 shoreline-mapping literature.
- Add the missing Carrère et al. (2022, FES2022) entry to references.bib and fix
  its alphabetical placement in the reference list.
- Mirror citation additions in the Korean draft; rebuild PDFs and DOCX.

Co-Authored-By: Claude Opus 4.8 (1M context) <noreply@anthropic.com>
</commit_message>
<xml_diff>
--- a/manuscript/draft.docx
+++ b/manuscript/draft.docx
@@ -544,7 +544,7 @@
         <w:pStyle w:val="BodyText"/>
       </w:pPr>
       <w:r>
-        <w:t xml:space="preserve">A Digital Elevation Model (DEM) is the most useful single product over tidal flats because it (i) defines the inundation/exposure schedule of every pixel, (ii) supplies the baseline for monitoring vertical change due to deposition, erosion, or sea-level rise, and (iii) supports hydrodynamic modelling. Aerial LiDAR can in principle deliver a centimetre-precision DEM, but coverage is sparse, expensive, and rarely repeated in time (Wang et al., 2020).</w:t>
+        <w:t xml:space="preserve">A Digital Elevation Model (DEM) is the most useful single product over tidal flats because it (i) defines the inundation/exposure schedule of every pixel, (ii) supplies the baseline for monitoring vertical change due to deposition, erosion, or sea-level rise, and (iii) supports hydrodynamic modelling. Aerial LiDAR can in principle deliver a centimetre-precision DEM, but coverage is sparse, expensive, and rarely repeated in time. Spaceborne ICESat-2 laser altimetry now provides repeatable, centimetre-level intertidal elevation control over tidal flats, although its sparse, discontinuous ground tracks limit standalone DEM density (Xu et al., 2022).</w:t>
       </w:r>
     </w:p>
     <w:bookmarkEnd w:id="10"/>
@@ -641,7 +641,7 @@
         <w:t xml:space="preserve"> </w:t>
       </w:r>
       <w:r>
-        <w:t xml:space="preserve">is the tide height referenced to a benchmark datum at the nearest gauge. Stacking many waterlines from images at different tidal stages discretises the intertidal hypsometric curve, which is then interpolated into a DEM. Variants of this approach underpin the Digital Earth Australia Intertidal product (Sagar et al., 2017; Bishop-Taylor et al., 2019a) and a growing global literature (Liu et al., 2015; Tseng et al., 2017; Khan et al., 2019; Salameh et al., 2019).</w:t>
+        <w:t xml:space="preserve">is the tide height referenced to a benchmark datum at the nearest gauge. Stacking many waterlines from images at different tidal stages discretises the intertidal hypsometric curve, which is then interpolated into a DEM. Variants of this approach underpin the Digital Earth Australia Intertidal product (Sagar et al., 2017; Bishop-Taylor et al., 2019a) and a growing global literature (Liu et al., 2015; Tseng et al., 2017; Khan et al., 2019; Salameh et al., 2019; Wang et al., 2020). A complementary line of work derives intertidal elevation more directly, combining ICESat-2 laser altimetry with optical or SAR waterlines to anchor the vertical reference (Zhang et al., 2022; Xin et al., 2025).</w:t>
       </w:r>
     </w:p>
     <w:p>
@@ -13232,7 +13232,7 @@
         <w:t xml:space="preserve"> </w:t>
       </w:r>
       <w:r>
-        <w:t xml:space="preserve">from contours within the sampled range, with no empirical constraint. Users of such DEMs should be cautious about applications dependent on the upper intertidal — including aquaculture zoning, salt-marsh edge mapping, and storm-surge inundation modelling.</w:t>
+        <w:t xml:space="preserve">from contours within the sampled range, with no empirical constraint. Users of such DEMs should be cautious about applications dependent on the upper intertidal — including aquaculture zoning, salt-marsh edge mapping, and storm-surge inundation modelling. Direct laser altimetry offers a complementary constraint here: ICESat-2 measures surface elevation independently of the optical tidal-sampling geometry and can in principle anchor the upper-intertidal band that no optical scene reaches (Xu et al., 2022; Xin et al., 2025), albeit only along sparse, discontinuous ground tracks.</w:t>
       </w:r>
     </w:p>
     <w:p>
@@ -15644,6 +15644,7 @@
     </w:p>
     <w:p>
       <w:pPr>
+        <w:pStyle w:val="Compact"/>
         <w:numPr>
           <w:ilvl w:val="0"/>
           <w:numId w:val="1016"/>
@@ -15671,6 +15672,7 @@
     </w:p>
     <w:p>
       <w:pPr>
+        <w:pStyle w:val="Compact"/>
         <w:numPr>
           <w:ilvl w:val="0"/>
           <w:numId w:val="1016"/>
@@ -15698,6 +15700,7 @@
     </w:p>
     <w:p>
       <w:pPr>
+        <w:pStyle w:val="Compact"/>
         <w:numPr>
           <w:ilvl w:val="0"/>
           <w:numId w:val="1016"/>
@@ -15725,13 +15728,14 @@
     </w:p>
     <w:p>
       <w:pPr>
+        <w:pStyle w:val="Compact"/>
         <w:numPr>
           <w:ilvl w:val="0"/>
           <w:numId w:val="1016"/>
         </w:numPr>
       </w:pPr>
       <w:r>
-        <w:t xml:space="preserve">Choi, B.-J., Hwang, C., Lee, S. H., 2014.</w:t>
+        <w:t xml:space="preserve">Carrère, L., Lyard, F., Cancet, M., Allain, D., Dabat, M.-L., Fouchet, E., Faugère, Y., Pujol, M.-I., Briol, F., Dibarboure, G., Picot, N., 2022.</w:t>
       </w:r>
       <w:r>
         <w:t xml:space="preserve"> </w:t>
@@ -15741,24 +15745,25 @@
           <w:i/>
           <w:iCs/>
         </w:rPr>
-        <w:t xml:space="preserve">Meteotsunami-tide interactions and high-frequency sea level oscillations in the eastern Yellow Sea.</w:t>
-      </w:r>
-      <w:r>
-        <w:t xml:space="preserve"> </w:t>
-      </w:r>
-      <w:r>
-        <w:t xml:space="preserve">Journal of Geophysical Research: Oceans 119, 6725–6742. doi:10.1002/2013JC009788.</w:t>
-      </w:r>
-    </w:p>
-    <w:p>
-      <w:pPr>
+        <w:t xml:space="preserve">A new barotropic tide model for global ocean: FES2022.</w:t>
+      </w:r>
+      <w:r>
+        <w:t xml:space="preserve"> </w:t>
+      </w:r>
+      <w:r>
+        <w:t xml:space="preserve">AVISO+ technical note (FES2022 / FES2022b release notes), CNES/CLS. Available via AVISO+ Tides Modelling: https://www.aviso.altimetry.fr/en/data/products/auxiliary-products/global-tide-fes.html.</w:t>
+      </w:r>
+    </w:p>
+    <w:p>
+      <w:pPr>
+        <w:pStyle w:val="Compact"/>
         <w:numPr>
           <w:ilvl w:val="0"/>
           <w:numId w:val="1016"/>
         </w:numPr>
       </w:pPr>
       <w:r>
-        <w:t xml:space="preserve">Codiga, D. L., 2011.</w:t>
+        <w:t xml:space="preserve">Choi, B.-J., Hwang, C., Lee, S. H., 2014.</w:t>
       </w:r>
       <w:r>
         <w:t xml:space="preserve"> </w:t>
@@ -15768,24 +15773,25 @@
           <w:i/>
           <w:iCs/>
         </w:rPr>
-        <w:t xml:space="preserve">Unified Tidal Analysis and Prediction Using the UTide Matlab Functions.</w:t>
-      </w:r>
-      <w:r>
-        <w:t xml:space="preserve"> </w:t>
-      </w:r>
-      <w:r>
-        <w:t xml:space="preserve">Technical Report 2011-01, Graduate School of Oceanography, University of Rhode Island, Narragansett, Rhode Island. 59 pp.</w:t>
-      </w:r>
-    </w:p>
-    <w:p>
-      <w:pPr>
+        <w:t xml:space="preserve">Meteotsunami-tide interactions and high-frequency sea level oscillations in the eastern Yellow Sea.</w:t>
+      </w:r>
+      <w:r>
+        <w:t xml:space="preserve"> </w:t>
+      </w:r>
+      <w:r>
+        <w:t xml:space="preserve">Journal of Geophysical Research: Oceans 119, 6725–6742. doi:10.1002/2013JC009788.</w:t>
+      </w:r>
+    </w:p>
+    <w:p>
+      <w:pPr>
+        <w:pStyle w:val="Compact"/>
         <w:numPr>
           <w:ilvl w:val="0"/>
           <w:numId w:val="1016"/>
         </w:numPr>
       </w:pPr>
       <w:r>
-        <w:t xml:space="preserve">Drusch, M., Del Bello, U., Carlier, S., Colin, O., Fernandez, V., Gascon, F., Hoersch, B., Isola, C., Laberinti, P., Martimort, P., Meygret, A., Spoto, F., Sy, O., Marchese, F., Bargellini, P., 2012.</w:t>
+        <w:t xml:space="preserve">Codiga, D. L., 2011.</w:t>
       </w:r>
       <w:r>
         <w:t xml:space="preserve"> </w:t>
@@ -15795,24 +15801,25 @@
           <w:i/>
           <w:iCs/>
         </w:rPr>
-        <w:t xml:space="preserve">Sentinel-2: ESA’s optical high-resolution mission for GMES operational services.</w:t>
-      </w:r>
-      <w:r>
-        <w:t xml:space="preserve"> </w:t>
-      </w:r>
-      <w:r>
-        <w:t xml:space="preserve">Remote Sensing of Environment 120, 25–36. doi:10.1016/j.rse.2011.11.026.</w:t>
-      </w:r>
-    </w:p>
-    <w:p>
-      <w:pPr>
+        <w:t xml:space="preserve">Unified Tidal Analysis and Prediction Using the UTide Matlab Functions.</w:t>
+      </w:r>
+      <w:r>
+        <w:t xml:space="preserve"> </w:t>
+      </w:r>
+      <w:r>
+        <w:t xml:space="preserve">Technical Report 2011-01, Graduate School of Oceanography, University of Rhode Island, Narragansett, Rhode Island. 59 pp.</w:t>
+      </w:r>
+    </w:p>
+    <w:p>
+      <w:pPr>
+        <w:pStyle w:val="Compact"/>
         <w:numPr>
           <w:ilvl w:val="0"/>
           <w:numId w:val="1016"/>
         </w:numPr>
       </w:pPr>
       <w:r>
-        <w:t xml:space="preserve">Egbert, G. D., Erofeeva, S. Y., 2002.</w:t>
+        <w:t xml:space="preserve">Drusch, M., Del Bello, U., Carlier, S., Colin, O., Fernandez, V., Gascon, F., Hoersch, B., Isola, C., Laberinti, P., Martimort, P., Meygret, A., Spoto, F., Sy, O., Marchese, F., Bargellini, P., 2012.</w:t>
       </w:r>
       <w:r>
         <w:t xml:space="preserve"> </w:t>
@@ -15822,24 +15829,25 @@
           <w:i/>
           <w:iCs/>
         </w:rPr>
-        <w:t xml:space="preserve">Efficient inverse modeling of barotropic ocean tides.</w:t>
-      </w:r>
-      <w:r>
-        <w:t xml:space="preserve"> </w:t>
-      </w:r>
-      <w:r>
-        <w:t xml:space="preserve">Journal of Atmospheric and Oceanic Technology 19, 183–204. doi:10.1175/1520-0426(2002)019&lt;0183:EIMOBO&gt;2.0.CO;2.</w:t>
-      </w:r>
-    </w:p>
-    <w:p>
-      <w:pPr>
+        <w:t xml:space="preserve">Sentinel-2: ESA’s optical high-resolution mission for GMES operational services.</w:t>
+      </w:r>
+      <w:r>
+        <w:t xml:space="preserve"> </w:t>
+      </w:r>
+      <w:r>
+        <w:t xml:space="preserve">Remote Sensing of Environment 120, 25–36. doi:10.1016/j.rse.2011.11.026.</w:t>
+      </w:r>
+    </w:p>
+    <w:p>
+      <w:pPr>
+        <w:pStyle w:val="Compact"/>
         <w:numPr>
           <w:ilvl w:val="0"/>
           <w:numId w:val="1016"/>
         </w:numPr>
       </w:pPr>
       <w:r>
-        <w:t xml:space="preserve">Gorelick, N., Hancher, M., Dixon, M., Ilyushchenko, S., Thau, D., Moore, R., 2017.</w:t>
+        <w:t xml:space="preserve">Egbert, G. D., Erofeeva, S. Y., 2002.</w:t>
       </w:r>
       <w:r>
         <w:t xml:space="preserve"> </w:t>
@@ -15849,24 +15857,25 @@
           <w:i/>
           <w:iCs/>
         </w:rPr>
-        <w:t xml:space="preserve">Google Earth Engine: Planetary-scale geospatial analysis for everyone.</w:t>
-      </w:r>
-      <w:r>
-        <w:t xml:space="preserve"> </w:t>
-      </w:r>
-      <w:r>
-        <w:t xml:space="preserve">Remote Sensing of Environment 202, 18–27. doi:10.1016/j.rse.2017.06.031.</w:t>
-      </w:r>
-    </w:p>
-    <w:p>
-      <w:pPr>
+        <w:t xml:space="preserve">Efficient inverse modeling of barotropic ocean tides.</w:t>
+      </w:r>
+      <w:r>
+        <w:t xml:space="preserve"> </w:t>
+      </w:r>
+      <w:r>
+        <w:t xml:space="preserve">Journal of Atmospheric and Oceanic Technology 19, 183–204. doi:10.1175/1520-0426(2002)019&lt;0183:EIMOBO&gt;2.0.CO;2.</w:t>
+      </w:r>
+    </w:p>
+    <w:p>
+      <w:pPr>
+        <w:pStyle w:val="Compact"/>
         <w:numPr>
           <w:ilvl w:val="0"/>
           <w:numId w:val="1016"/>
         </w:numPr>
       </w:pPr>
       <w:r>
-        <w:t xml:space="preserve">Heygster, G., Dannenberg, J., Notholt, J., 2010.</w:t>
+        <w:t xml:space="preserve">Gorelick, N., Hancher, M., Dixon, M., Ilyushchenko, S., Thau, D., Moore, R., 2017.</w:t>
       </w:r>
       <w:r>
         <w:t xml:space="preserve"> </w:t>
@@ -15876,24 +15885,25 @@
           <w:i/>
           <w:iCs/>
         </w:rPr>
-        <w:t xml:space="preserve">Topographic mapping of the German tidal flats analyzing SAR images with the waterline method.</w:t>
-      </w:r>
-      <w:r>
-        <w:t xml:space="preserve"> </w:t>
-      </w:r>
-      <w:r>
-        <w:t xml:space="preserve">IEEE Transactions on Geoscience and Remote Sensing 48, 1019–1030. doi:10.1109/TGRS.2009.2031843.</w:t>
-      </w:r>
-    </w:p>
-    <w:p>
-      <w:pPr>
+        <w:t xml:space="preserve">Google Earth Engine: Planetary-scale geospatial analysis for everyone.</w:t>
+      </w:r>
+      <w:r>
+        <w:t xml:space="preserve"> </w:t>
+      </w:r>
+      <w:r>
+        <w:t xml:space="preserve">Remote Sensing of Environment 202, 18–27. doi:10.1016/j.rse.2017.06.031.</w:t>
+      </w:r>
+    </w:p>
+    <w:p>
+      <w:pPr>
+        <w:pStyle w:val="Compact"/>
         <w:numPr>
           <w:ilvl w:val="0"/>
           <w:numId w:val="1016"/>
         </w:numPr>
       </w:pPr>
       <w:r>
-        <w:t xml:space="preserve">Khan, M. J. U., Ansary, M. N., Durand, F., Testut, L., Ishaque, M., Calmant, S., Krien, Y., Islam, A. K. M. S., Papa, F., 2019.</w:t>
+        <w:t xml:space="preserve">Heygster, G., Dannenberg, J., Notholt, J., 2010.</w:t>
       </w:r>
       <w:r>
         <w:t xml:space="preserve"> </w:t>
@@ -15903,24 +15913,25 @@
           <w:i/>
           <w:iCs/>
         </w:rPr>
-        <w:t xml:space="preserve">High-resolution intertidal topography from Sentinel-2 multi-spectral imagery: Synergy between remote sensing and numerical modeling.</w:t>
-      </w:r>
-      <w:r>
-        <w:t xml:space="preserve"> </w:t>
-      </w:r>
-      <w:r>
-        <w:t xml:space="preserve">Remote Sensing 11, 2888. doi:10.3390/rs11242888.</w:t>
-      </w:r>
-    </w:p>
-    <w:p>
-      <w:pPr>
+        <w:t xml:space="preserve">Topographic mapping of the German tidal flats analyzing SAR images with the waterline method.</w:t>
+      </w:r>
+      <w:r>
+        <w:t xml:space="preserve"> </w:t>
+      </w:r>
+      <w:r>
+        <w:t xml:space="preserve">IEEE Transactions on Geoscience and Remote Sensing 48, 1019–1030. doi:10.1109/TGRS.2009.2031843.</w:t>
+      </w:r>
+    </w:p>
+    <w:p>
+      <w:pPr>
+        <w:pStyle w:val="Compact"/>
         <w:numPr>
           <w:ilvl w:val="0"/>
           <w:numId w:val="1016"/>
         </w:numPr>
       </w:pPr>
       <w:r>
-        <w:t xml:space="preserve">Koh, C.-H., Khim, J. S., 2014.</w:t>
+        <w:t xml:space="preserve">Khan, M. J. U., Ansary, M. N., Durand, F., Testut, L., Ishaque, M., Calmant, S., Krien, Y., Islam, A. K. M. S., Papa, F., 2019.</w:t>
       </w:r>
       <w:r>
         <w:t xml:space="preserve"> </w:t>
@@ -15930,24 +15941,25 @@
           <w:i/>
           <w:iCs/>
         </w:rPr>
-        <w:t xml:space="preserve">The Korean tidal flat of the Yellow Sea: Physical setting, ecosystem and management.</w:t>
-      </w:r>
-      <w:r>
-        <w:t xml:space="preserve"> </w:t>
-      </w:r>
-      <w:r>
-        <w:t xml:space="preserve">Ocean &amp; Coastal Management 102, 398–414. doi:10.1016/j.ocecoaman.2014.07.008.</w:t>
-      </w:r>
-    </w:p>
-    <w:p>
-      <w:pPr>
+        <w:t xml:space="preserve">High-resolution intertidal topography from Sentinel-2 multi-spectral imagery: Synergy between remote sensing and numerical modeling.</w:t>
+      </w:r>
+      <w:r>
+        <w:t xml:space="preserve"> </w:t>
+      </w:r>
+      <w:r>
+        <w:t xml:space="preserve">Remote Sensing 11, 2888. doi:10.3390/rs11242888.</w:t>
+      </w:r>
+    </w:p>
+    <w:p>
+      <w:pPr>
+        <w:pStyle w:val="Compact"/>
         <w:numPr>
           <w:ilvl w:val="0"/>
           <w:numId w:val="1016"/>
         </w:numPr>
       </w:pPr>
       <w:r>
-        <w:t xml:space="preserve">Lee, J., Kim, K., Kwak, G.-H., Baek, W.-K., Jang, Y., Ryu, J.-H., 2025.</w:t>
+        <w:t xml:space="preserve">Koh, C.-H., Khim, J. S., 2014.</w:t>
       </w:r>
       <w:r>
         <w:t xml:space="preserve"> </w:t>
@@ -15957,24 +15969,25 @@
           <w:i/>
           <w:iCs/>
         </w:rPr>
-        <w:t xml:space="preserve">Optimization of a multi-sensor satellite-based waterline method for rapid and extensive tidal flat topography mapping.</w:t>
-      </w:r>
-      <w:r>
-        <w:t xml:space="preserve"> </w:t>
-      </w:r>
-      <w:r>
-        <w:t xml:space="preserve">Estuarine, Coastal and Shelf Science 318, 109235. doi:10.1016/j.ecss.2025.109235.</w:t>
-      </w:r>
-    </w:p>
-    <w:p>
-      <w:pPr>
+        <w:t xml:space="preserve">The Korean tidal flat of the Yellow Sea: Physical setting, ecosystem and management.</w:t>
+      </w:r>
+      <w:r>
+        <w:t xml:space="preserve"> </w:t>
+      </w:r>
+      <w:r>
+        <w:t xml:space="preserve">Ocean &amp; Coastal Management 102, 398–414. doi:10.1016/j.ocecoaman.2014.07.008.</w:t>
+      </w:r>
+    </w:p>
+    <w:p>
+      <w:pPr>
+        <w:pStyle w:val="Compact"/>
         <w:numPr>
           <w:ilvl w:val="0"/>
           <w:numId w:val="1016"/>
         </w:numPr>
       </w:pPr>
       <w:r>
-        <w:t xml:space="preserve">Lee, K., Nam, S., Cho, Y.-K., Jeong, K.-Y., Byun, D.-S., 2022.</w:t>
+        <w:t xml:space="preserve">Lee, J., Kim, K., Kwak, G.-H., Baek, W.-K., Jang, Y., Ryu, J.-H., 2025.</w:t>
       </w:r>
       <w:r>
         <w:t xml:space="preserve"> </w:t>
@@ -15984,24 +15997,25 @@
           <w:i/>
           <w:iCs/>
         </w:rPr>
-        <w:t xml:space="preserve">Determination of long-term (1993–2019) sea level rise trends around the Korean Peninsula using ocean tide-corrected, multi-mission satellite altimetry data.</w:t>
-      </w:r>
-      <w:r>
-        <w:t xml:space="preserve"> </w:t>
-      </w:r>
-      <w:r>
-        <w:t xml:space="preserve">Frontiers in Marine Science 9, 810549. doi:10.3389/fmars.2022.810549.</w:t>
-      </w:r>
-    </w:p>
-    <w:p>
-      <w:pPr>
+        <w:t xml:space="preserve">Optimization of a multi-sensor satellite-based waterline method for rapid and extensive tidal flat topography mapping.</w:t>
+      </w:r>
+      <w:r>
+        <w:t xml:space="preserve"> </w:t>
+      </w:r>
+      <w:r>
+        <w:t xml:space="preserve">Estuarine, Coastal and Shelf Science 318, 109235. doi:10.1016/j.ecss.2025.109235.</w:t>
+      </w:r>
+    </w:p>
+    <w:p>
+      <w:pPr>
+        <w:pStyle w:val="Compact"/>
         <w:numPr>
           <w:ilvl w:val="0"/>
           <w:numId w:val="1016"/>
         </w:numPr>
       </w:pPr>
       <w:r>
-        <w:t xml:space="preserve">Lee, S.-K., Ryu, J.-H., 2017.</w:t>
+        <w:t xml:space="preserve">Lee, K., Nam, S., Cho, Y.-K., Jeong, K.-Y., Byun, D.-S., 2022.</w:t>
       </w:r>
       <w:r>
         <w:t xml:space="preserve"> </w:t>
@@ -16011,24 +16025,25 @@
           <w:i/>
           <w:iCs/>
         </w:rPr>
-        <w:t xml:space="preserve">High-accuracy tidal flat digital elevation model construction using TanDEM-X science phase data.</w:t>
-      </w:r>
-      <w:r>
-        <w:t xml:space="preserve"> </w:t>
-      </w:r>
-      <w:r>
-        <w:t xml:space="preserve">IEEE Journal of Selected Topics in Applied Earth Observations and Remote Sensing 10, 2713–2724. doi:10.1109/JSTARS.2017.2656629.</w:t>
-      </w:r>
-    </w:p>
-    <w:p>
-      <w:pPr>
+        <w:t xml:space="preserve">Determination of long-term (1993–2019) sea level rise trends around the Korean Peninsula using ocean tide-corrected, multi-mission satellite altimetry data.</w:t>
+      </w:r>
+      <w:r>
+        <w:t xml:space="preserve"> </w:t>
+      </w:r>
+      <w:r>
+        <w:t xml:space="preserve">Frontiers in Marine Science 9, 810549. doi:10.3389/fmars.2022.810549.</w:t>
+      </w:r>
+    </w:p>
+    <w:p>
+      <w:pPr>
+        <w:pStyle w:val="Compact"/>
         <w:numPr>
           <w:ilvl w:val="0"/>
           <w:numId w:val="1016"/>
         </w:numPr>
       </w:pPr>
       <w:r>
-        <w:t xml:space="preserve">Liu, Y., Zhou, M., Zhao, S., Zhan, W., Yang, K., Li, M., 2015.</w:t>
+        <w:t xml:space="preserve">Lee, S.-K., Ryu, J.-H., 2017.</w:t>
       </w:r>
       <w:r>
         <w:t xml:space="preserve"> </w:t>
@@ -16038,24 +16053,25 @@
           <w:i/>
           <w:iCs/>
         </w:rPr>
-        <w:t xml:space="preserve">Automated extraction of tidal creeks from airborne laser altimetry data.</w:t>
-      </w:r>
-      <w:r>
-        <w:t xml:space="preserve"> </w:t>
-      </w:r>
-      <w:r>
-        <w:t xml:space="preserve">Journal of Hydrology 527, 1006–1020. doi:10.1016/j.jhydrol.2015.05.058.</w:t>
-      </w:r>
-    </w:p>
-    <w:p>
-      <w:pPr>
+        <w:t xml:space="preserve">High-accuracy tidal flat digital elevation model construction using TanDEM-X science phase data.</w:t>
+      </w:r>
+      <w:r>
+        <w:t xml:space="preserve"> </w:t>
+      </w:r>
+      <w:r>
+        <w:t xml:space="preserve">IEEE Journal of Selected Topics in Applied Earth Observations and Remote Sensing 10, 2713–2724. doi:10.1109/JSTARS.2017.2656629.</w:t>
+      </w:r>
+    </w:p>
+    <w:p>
+      <w:pPr>
+        <w:pStyle w:val="Compact"/>
         <w:numPr>
           <w:ilvl w:val="0"/>
           <w:numId w:val="1016"/>
         </w:numPr>
       </w:pPr>
       <w:r>
-        <w:t xml:space="preserve">Lyard, F. H., Allain, D. J., Cancet, M., Carrère, L., Picot, N., 2021.</w:t>
+        <w:t xml:space="preserve">Liu, Y., Zhou, M., Zhao, S., Zhan, W., Yang, K., Li, M., 2015.</w:t>
       </w:r>
       <w:r>
         <w:t xml:space="preserve"> </w:t>
@@ -16065,24 +16081,25 @@
           <w:i/>
           <w:iCs/>
         </w:rPr>
-        <w:t xml:space="preserve">FES2014 global ocean tide atlas: Design and performance.</w:t>
-      </w:r>
-      <w:r>
-        <w:t xml:space="preserve"> </w:t>
-      </w:r>
-      <w:r>
-        <w:t xml:space="preserve">Ocean Science 17, 615–649. doi:10.5194/os-17-615-2021.</w:t>
-      </w:r>
-    </w:p>
-    <w:p>
-      <w:pPr>
+        <w:t xml:space="preserve">Automated extraction of tidal creeks from airborne laser altimetry data.</w:t>
+      </w:r>
+      <w:r>
+        <w:t xml:space="preserve"> </w:t>
+      </w:r>
+      <w:r>
+        <w:t xml:space="preserve">Journal of Hydrology 527, 1006–1020. doi:10.1016/j.jhydrol.2015.05.058.</w:t>
+      </w:r>
+    </w:p>
+    <w:p>
+      <w:pPr>
+        <w:pStyle w:val="Compact"/>
         <w:numPr>
           <w:ilvl w:val="0"/>
           <w:numId w:val="1016"/>
         </w:numPr>
       </w:pPr>
       <w:r>
-        <w:t xml:space="preserve">Carrère, L., Lyard, F., Cancet, M., Allain, D., Dabat, M.-L., Fouchet, E., Faugère, Y., Pujol, M.-I., Briol, F., Dibarboure, G., Picot, N., 2022.</w:t>
+        <w:t xml:space="preserve">Lyard, F. H., Allain, D. J., Cancet, M., Carrère, L., Picot, N., 2021.</w:t>
       </w:r>
       <w:r>
         <w:t xml:space="preserve"> </w:t>
@@ -16092,17 +16109,18 @@
           <w:i/>
           <w:iCs/>
         </w:rPr>
-        <w:t xml:space="preserve">A new barotropic tide model for global ocean: FES2022.</w:t>
-      </w:r>
-      <w:r>
-        <w:t xml:space="preserve"> </w:t>
-      </w:r>
-      <w:r>
-        <w:t xml:space="preserve">AVISO+ technical note (FES2022 / FES2022b release notes), CNES/CLS. Available via AVISO+ Tides Modelling: https://www.aviso.altimetry.fr/en/data/products/auxiliary-products/global-tide-fes.html.</w:t>
-      </w:r>
-    </w:p>
-    <w:p>
-      <w:pPr>
+        <w:t xml:space="preserve">FES2014 global ocean tide atlas: Design and performance.</w:t>
+      </w:r>
+      <w:r>
+        <w:t xml:space="preserve"> </w:t>
+      </w:r>
+      <w:r>
+        <w:t xml:space="preserve">Ocean Science 17, 615–649. doi:10.5194/os-17-615-2021.</w:t>
+      </w:r>
+    </w:p>
+    <w:p>
+      <w:pPr>
+        <w:pStyle w:val="Compact"/>
         <w:numPr>
           <w:ilvl w:val="0"/>
           <w:numId w:val="1016"/>
@@ -16158,6 +16176,7 @@
     </w:p>
     <w:p>
       <w:pPr>
+        <w:pStyle w:val="Compact"/>
         <w:numPr>
           <w:ilvl w:val="0"/>
           <w:numId w:val="1016"/>
@@ -16185,6 +16204,7 @@
     </w:p>
     <w:p>
       <w:pPr>
+        <w:pStyle w:val="Compact"/>
         <w:numPr>
           <w:ilvl w:val="0"/>
           <w:numId w:val="1016"/>
@@ -16212,6 +16232,7 @@
     </w:p>
     <w:p>
       <w:pPr>
+        <w:pStyle w:val="Compact"/>
         <w:numPr>
           <w:ilvl w:val="0"/>
           <w:numId w:val="1016"/>
@@ -16239,6 +16260,7 @@
     </w:p>
     <w:p>
       <w:pPr>
+        <w:pStyle w:val="Compact"/>
         <w:numPr>
           <w:ilvl w:val="0"/>
           <w:numId w:val="1016"/>
@@ -16266,6 +16288,7 @@
     </w:p>
     <w:p>
       <w:pPr>
+        <w:pStyle w:val="Compact"/>
         <w:numPr>
           <w:ilvl w:val="0"/>
           <w:numId w:val="1016"/>
@@ -16293,6 +16316,7 @@
     </w:p>
     <w:p>
       <w:pPr>
+        <w:pStyle w:val="Compact"/>
         <w:numPr>
           <w:ilvl w:val="0"/>
           <w:numId w:val="1016"/>
@@ -16320,6 +16344,7 @@
     </w:p>
     <w:p>
       <w:pPr>
+        <w:pStyle w:val="Compact"/>
         <w:numPr>
           <w:ilvl w:val="0"/>
           <w:numId w:val="1016"/>
@@ -16347,6 +16372,7 @@
     </w:p>
     <w:p>
       <w:pPr>
+        <w:pStyle w:val="Compact"/>
         <w:numPr>
           <w:ilvl w:val="0"/>
           <w:numId w:val="1016"/>
@@ -16374,6 +16400,7 @@
     </w:p>
     <w:p>
       <w:pPr>
+        <w:pStyle w:val="Compact"/>
         <w:numPr>
           <w:ilvl w:val="0"/>
           <w:numId w:val="1016"/>
@@ -16401,6 +16428,7 @@
     </w:p>
     <w:p>
       <w:pPr>
+        <w:pStyle w:val="Compact"/>
         <w:numPr>
           <w:ilvl w:val="0"/>
           <w:numId w:val="1016"/>
@@ -16428,6 +16456,7 @@
     </w:p>
     <w:p>
       <w:pPr>
+        <w:pStyle w:val="Compact"/>
         <w:numPr>
           <w:ilvl w:val="0"/>
           <w:numId w:val="1016"/>
@@ -16455,13 +16484,14 @@
     </w:p>
     <w:p>
       <w:pPr>
+        <w:pStyle w:val="Compact"/>
         <w:numPr>
           <w:ilvl w:val="0"/>
           <w:numId w:val="1016"/>
         </w:numPr>
       </w:pPr>
       <w:r>
-        <w:t xml:space="preserve">Yun, G. R., Ryu, J.-H., Kim, K. L., Lee, J. H., Lee, S.-K., 2022.</w:t>
+        <w:t xml:space="preserve">Xin, H., Xu, N., Xu, H., Yang, H., Wang, Z., Zhang, Z., Ding, Y., Luan, H., Ou, Y., Yang, Y., 2025.</w:t>
       </w:r>
       <w:r>
         <w:t xml:space="preserve"> </w:t>
@@ -16471,6 +16501,62 @@
           <w:i/>
           <w:iCs/>
         </w:rPr>
+        <w:t xml:space="preserve">Mapping tidal flat topography by combining ICESat-2 laser altimetry and multi-source satellite imagery.</w:t>
+      </w:r>
+      <w:r>
+        <w:t xml:space="preserve"> </w:t>
+      </w:r>
+      <w:r>
+        <w:t xml:space="preserve">International Journal of Digital Earth 18 (2), 2554313. doi:10.1080/17538947.2025.2554313.</w:t>
+      </w:r>
+    </w:p>
+    <w:p>
+      <w:pPr>
+        <w:pStyle w:val="Compact"/>
+        <w:numPr>
+          <w:ilvl w:val="0"/>
+          <w:numId w:val="1016"/>
+        </w:numPr>
+      </w:pPr>
+      <w:r>
+        <w:t xml:space="preserve">Xu, N., Ma, Y., Yang, J., Wang, X. H., Wang, Y., Xu, R., 2022.</w:t>
+      </w:r>
+      <w:r>
+        <w:t xml:space="preserve"> </w:t>
+      </w:r>
+      <w:r>
+        <w:rPr>
+          <w:i/>
+          <w:iCs/>
+        </w:rPr>
+        <w:t xml:space="preserve">Deriving tidal flat topography using ICESat-2 laser altimetry and Sentinel-2 imagery.</w:t>
+      </w:r>
+      <w:r>
+        <w:t xml:space="preserve"> </w:t>
+      </w:r>
+      <w:r>
+        <w:t xml:space="preserve">Geophysical Research Letters 49, e2021GL096813. doi:10.1029/2021GL096813.</w:t>
+      </w:r>
+    </w:p>
+    <w:p>
+      <w:pPr>
+        <w:pStyle w:val="Compact"/>
+        <w:numPr>
+          <w:ilvl w:val="0"/>
+          <w:numId w:val="1016"/>
+        </w:numPr>
+      </w:pPr>
+      <w:r>
+        <w:t xml:space="preserve">Yun, G. R., Ryu, J.-H., Kim, K. L., Lee, J. H., Lee, S.-K., 2022.</w:t>
+      </w:r>
+      <w:r>
+        <w:t xml:space="preserve"> </w:t>
+      </w:r>
+      <w:r>
+        <w:rPr>
+          <w:i/>
+          <w:iCs/>
+        </w:rPr>
         <w:t xml:space="preserve">TanDEM-X-based Ganghwa tidal flat high-resolution topographic map construction and service.</w:t>
       </w:r>
       <w:r>
@@ -16478,6 +16564,34 @@
       </w:r>
       <w:r>
         <w:t xml:space="preserve">GEO DATA 4 (1), 37–42. doi:10.22761/DJ2022.4.1.004.</w:t>
+      </w:r>
+    </w:p>
+    <w:p>
+      <w:pPr>
+        <w:pStyle w:val="Compact"/>
+        <w:numPr>
+          <w:ilvl w:val="0"/>
+          <w:numId w:val="1016"/>
+        </w:numPr>
+      </w:pPr>
+      <w:r>
+        <w:t xml:space="preserve">Zhang, S., Xu, Q., Wang, H., Kang, Y., Li, X., 2022.</w:t>
+      </w:r>
+      <w:r>
+        <w:t xml:space="preserve"> </w:t>
+      </w:r>
+      <w:r>
+        <w:rPr>
+          <w:i/>
+          <w:iCs/>
+        </w:rPr>
+        <w:t xml:space="preserve">Automatic waterline extraction and topographic mapping of tidal flats from SAR images based on deep learning.</w:t>
+      </w:r>
+      <w:r>
+        <w:t xml:space="preserve"> </w:t>
+      </w:r>
+      <w:r>
+        <w:t xml:space="preserve">Geophysical Research Letters 49, e2021GL096007. doi:10.1029/2021GL096007.</w:t>
       </w:r>
     </w:p>
     <w:bookmarkEnd w:id="71"/>

</xml_diff>

<commit_message>
References: re-attribute tidal-aliasing to Bishop-Taylor 2019a; drop misplaced Liu 2015
Verified against the source papers (web): Bishop-Taylor et al. (2019a, 'Between
the tides'/NIDEM) is the work that introduced the spread and low-/high-tide
offset indices documenting satellite tide-sampling bias — not 2019b, which is a
sub-pixel waterline-EXTRACTION accuracy paper. Re-attribute the aliasing claims
(§1.3, §3.1) to 2019a; cite 2019b in §1.2 for waterline-extraction accuracy.
Remove Liu et al. (2015) — tidal-creek extraction from LiDAR, not a waterline-DEM
method — from the §1.2 grouping and the reference list (EN, KO, bib). EN/KO lists
remain aligned (32/32).

Co-Authored-By: Claude Opus 4.8 (1M context) <noreply@anthropic.com>
</commit_message>
<xml_diff>
--- a/manuscript/draft.docx
+++ b/manuscript/draft.docx
@@ -641,7 +641,7 @@
         <w:t xml:space="preserve"> </w:t>
       </w:r>
       <w:r>
-        <w:t xml:space="preserve">is the tide height referenced to a benchmark datum at the nearest gauge. Stacking many waterlines from images at different tidal stages discretises the intertidal hypsometric curve, which is then interpolated into a DEM. Variants of this approach underpin the Digital Earth Australia Intertidal product (Sagar et al., 2017; Bishop-Taylor et al., 2019a) and a growing global literature (Liu et al., 2015; Tseng et al., 2017; Khan et al., 2019; Salameh et al., 2019; Wang et al., 2020). A complementary line of work derives intertidal elevation more directly, combining ICESat-2 laser altimetry with optical or SAR waterlines to anchor the vertical reference (Zhang et al., 2022; Xin et al., 2025).</w:t>
+        <w:t xml:space="preserve">is the tide height referenced to a benchmark datum at the nearest gauge. Stacking many waterlines from images at different tidal stages discretises the intertidal hypsometric curve, which is then interpolated into a DEM. Variants of this approach underpin the Digital Earth Australia Intertidal product (Sagar et al., 2017; Bishop-Taylor et al., 2019a), with the sub-pixel accuracy and index sensitivity of the waterline extraction itself characterised by Bishop-Taylor et al. (2019b), and a growing global literature (Tseng et al., 2017; Khan et al., 2019; Salameh et al., 2019; Wang et al., 2020). A complementary line of work derives intertidal elevation more directly, combining ICESat-2 laser altimetry with optical or SAR waterlines to anchor the vertical reference (Zhang et al., 2022; Xin et al., 2025).</w:t>
       </w:r>
     </w:p>
     <w:p>
@@ -746,7 +746,7 @@
         <w:t xml:space="preserve">incommensurate with the diurnal cycle</w:t>
       </w:r>
       <w:r>
-        <w:t xml:space="preserve">: each successive overpass at the same site occurs at a slightly different tidal phase, but only in a narrow time-of-day window. Bishop-Taylor et al. (2019b) documented the resulting</w:t>
+        <w:t xml:space="preserve">: each successive overpass at the same site occurs at a slightly different tidal phase, but only in a narrow time-of-day window. Bishop-Taylor et al. (2019a) documented the resulting</w:t>
       </w:r>
       <w:r>
         <w:t xml:space="preserve"> </w:t>
@@ -762,7 +762,7 @@
         <w:t xml:space="preserve"> </w:t>
       </w:r>
       <w:r>
-        <w:t xml:space="preserve">for the Digital Earth Australia Intertidal product, showing that satellite-sampled tide-height distributions exhibit a non-zero mean bias and a truncated range relative to the underlying tidal cycle; the open-source eo-tides package (Bishop-Taylor et al., 2025) has since made the diagnostic accessible at global scale. Sent et al. (2025) documented an analogous optical-sensor aliasing in the macrotidal Tagus estuary, Portugal, where Sentinel-2 turbidity retrievals are over-represented at spring low tide and under-represented at neap high tide. Despite these recognitions, no closed-form</w:t>
+        <w:t xml:space="preserve">for the Digital Earth Australia Intertidal product, introducing spread and low-/high-tide offset indices that show satellite-sampled tide-height distributions to exhibit a non-zero mean bias and a truncated range relative to the underlying tidal cycle; the open-source eo-tides package (Bishop-Taylor et al., 2025) has since made the diagnostic accessible at global scale. Sent et al. (2025) documented an analogous optical-sensor aliasing in the macrotidal Tagus estuary, Portugal, where Sentinel-2 turbidity retrievals are over-represented at spring low tide and under-represented at neap high tide. Despite these recognitions, no closed-form</w:t>
       </w:r>
       <w:r>
         <w:t xml:space="preserve"> </w:t>
@@ -3100,7 +3100,7 @@
         <w:pStyle w:val="FirstParagraph"/>
       </w:pPr>
       <w:r>
-        <w:t xml:space="preserve">For each (site, sensor) combination, we use the standard set of aliasing metrics introduced for sun-synchronous waterline analysis (Bishop-Taylor et al., 2019b; Bishop-Taylor et al., 2025):</w:t>
+        <w:t xml:space="preserve">For each (site, sensor) combination, we use the standard set of aliasing metrics introduced for sun-synchronous waterline analysis (Bishop-Taylor et al., 2019a; Bishop-Taylor et al., 2025):</w:t>
       </w:r>
     </w:p>
     <w:p>
@@ -16060,34 +16060,6 @@
       </w:r>
       <w:r>
         <w:t xml:space="preserve">IEEE Journal of Selected Topics in Applied Earth Observations and Remote Sensing 10, 2713–2724. doi:10.1109/JSTARS.2017.2656629.</w:t>
-      </w:r>
-    </w:p>
-    <w:p>
-      <w:pPr>
-        <w:pStyle w:val="Compact"/>
-        <w:numPr>
-          <w:ilvl w:val="0"/>
-          <w:numId w:val="1016"/>
-        </w:numPr>
-      </w:pPr>
-      <w:r>
-        <w:t xml:space="preserve">Liu, Y., Zhou, M., Zhao, S., Zhan, W., Yang, K., Li, M., 2015.</w:t>
-      </w:r>
-      <w:r>
-        <w:t xml:space="preserve"> </w:t>
-      </w:r>
-      <w:r>
-        <w:rPr>
-          <w:i/>
-          <w:iCs/>
-        </w:rPr>
-        <w:t xml:space="preserve">Automated extraction of tidal creeks from airborne laser altimetry data.</w:t>
-      </w:r>
-      <w:r>
-        <w:t xml:space="preserve"> </w:t>
-      </w:r>
-      <w:r>
-        <w:t xml:space="preserve">Journal of Hydrology 527, 1006–1020. doi:10.1016/j.jhydrol.2015.05.058.</w:t>
       </w:r>
     </w:p>
     <w:p>

</xml_diff>